<commit_message>
Feat: Add device soak CPU attribution
</commit_message>
<xml_diff>
--- a/docs/APM_框架对比报告.docx
+++ b/docs/APM_框架对比报告.docx
@@ -142,7 +142,7 @@
         <w:pStyle w:val="ListBullet"/>
       </w:pPr>
       <w:r>
-        <w:t>apm-benchmark 不进入 Maven publication；microbenchmark 固定 time/allocation，device-soak 固定 A/B/资源/时长/重启证据。</w:t>
+        <w:t>apm-benchmark 不进入 Maven publication；microbenchmark 固定 time/allocation，device-soak 固定 A/B/资源/时长/重启证据，并区分 enabled 绝对 CPU 门禁与 control/delta 归因。</w:t>
       </w:r>
     </w:p>
     <w:p>
@@ -617,7 +617,7 @@
                 <w:b w:val="0"/>
                 <w:sz w:val="18"/>
               </w:rPr>
-              <w:t>三项 microbenchmark 通过；FPS observer 修复后两轮原预算 smoke 以 12.928% / 12.362% CPU 通过；24h/72h 未执行</w:t>
+              <w:t>三项 microbenchmark 通过；FPS observer 修复后两轮原绝对预算 smoke 以 12.928% / 12.362% CPU 通过；schema v2 新增 control/enabled/delta CPU 归因且不放宽门禁；24h/72h 未执行</w:t>
             </w:r>
           </w:p>
         </w:tc>

</xml_diff>

<commit_message>
Fix: Retry transient ADB reads
</commit_message>
<xml_diff>
--- a/docs/APM_框架对比报告.docx
+++ b/docs/APM_框架对比报告.docx
@@ -151,6 +151,14 @@
       </w:pPr>
       <w:r>
         <w:t>apm-benchmark 不进入 Maven publication；microbenchmark 固定 time/allocation，device-soak 固定 A/B/资源/时长/重启证据，并区分 enabled 绝对 CPU 门禁与 control/delta 归因；OEM 禁止 pm clear 时只对所选 sample APK 卸载重装并记录 provenance。</w:t>
+      </w:r>
+    </w:p>
+    <w:p>
+      <w:pPr>
+        <w:pStyle w:val="ListBullet"/>
+      </w:pPr>
+      <w:r>
+        <w:t>device-soak 仅对只读证据命令做三类 ADB transport 瞬断的有界重试；安装、卸载、清理和 Activity 命令不自动重放，工件保留 retry count。</w:t>
       </w:r>
     </w:p>
     <w:p>

</xml_diff>

<commit_message>
Fix: Harden long device reconnects
</commit_message>
<xml_diff>
--- a/docs/APM_框架对比报告.docx
+++ b/docs/APM_框架对比报告.docx
@@ -158,7 +158,7 @@
         <w:pStyle w:val="ListBullet"/>
       </w:pPr>
       <w:r>
-        <w:t>device-soak 仅对只读证据命令做三类 ADB transport 瞬断的有界重试；安装、卸载、清理和 Activity 命令不自动重放，工件保留 retry count。</w:t>
+        <w:t>device-soak 仅对只读证据命令做三类 ADB transport 瞬断的有界重试；smoke/long 默认窗口为 30/300 秒、绝对上限 600 秒，副作用命令不自动重放，工件保留 window/retry count。</w:t>
       </w:r>
     </w:p>
     <w:p>
@@ -633,7 +633,7 @@
                 <w:b w:val="0"/>
                 <w:sz w:val="18"/>
               </w:rPr>
-              <w:t>三项 microbenchmark 通过；Redmi 修复后两轮原预算 smoke 通过；OnePlus Android 16 以限定包重装回退通过并产出 29.062 mAh/hour UID 功耗；24h/72h 未执行</w:t>
+              <w:t>三项 microbenchmark 通过；Redmi 当前代码 smoke 以 11.319% CPU 通过但无 UID power；OnePlus Android 16 预检产出 UID 功耗，首次 24h 因持续断连失败；24h/72h 未完成</w:t>
             </w:r>
           </w:p>
         </w:tc>

</xml_diff>